<commit_message>
Update docx write-up with all six POC results
Expanded from Lambda-only to cover the full three-stage exercise:
Stage 1 (Lambda, real AWS), Stage 2 (Python/Java/Node.js local, first
pass), Stage 3 (deliberately harder Java and Python cases with real
removed/deprecated APIs, empirically verified before building).

Co-Authored-By: Claude Sonnet 5 <noreply@anthropic.com>
</commit_message>
<xml_diff>
--- a/poc/AWS-Transform-Lambda-Runtime-Upgrade-POC.docx
+++ b/poc/AWS-Transform-Lambda-Runtime-Upgrade-POC.docx
@@ -8,7 +8,7 @@
         <w:jc w:val="center"/>
       </w:pPr>
       <w:r>
-        <w:t>AWS Transform — Lambda Node.js Runtime Upgrade</w:t>
+        <w:t>AWS Transform — Runtime Upgrade Proofs of Concept</w:t>
       </w:r>
     </w:p>
     <w:p>
@@ -18,9 +18,9 @@
       <w:r>
         <w:rPr>
           <w:color w:val="444444"/>
-          <w:sz w:val="32"/>
+          <w:sz w:val="30"/>
         </w:rPr>
-        <w:t>Hands-On Proof-of-Concept — Phase 2</w:t>
+        <w:t>Six hands-on POCs: one real AWS Lambda deployment, five local (Python × 2, Java × 2, Node.js)</w:t>
       </w:r>
     </w:p>
     <w:p>
@@ -66,7 +66,20 @@
     </w:p>
     <w:p>
       <w:r>
-        <w:t>AWS Transform is AWS’s agentic-AI modernization service. One of its capabilities, under the "AWS Transform custom" track, is automated programming-language runtime version upgrades (for example Java, Python, or Node.js version bumps), driven by a CLI called atx. This exercise had two phases:</w:t>
+        <w:rPr>
+          <w:b w:val="0"/>
+          <w:i w:val="0"/>
+        </w:rPr>
+        <w:t>AWS Transform is AWS’s agentic-AI modernization service. Under its "AWS Transform custom" track, it can perform automated programming-language runtime version upgrades — driven by a CLI called atx — using either AWS-managed transformation definitions (pre-built, maintained by AWS) or custom ones you author yourself. This exercise used only AWS-managed transformations throughout, deliberately, to test the capability as AWS ships it rather than anything custom-written.</w:t>
+      </w:r>
+    </w:p>
+    <w:p>
+      <w:r>
+        <w:rPr>
+          <w:b w:val="0"/>
+          <w:i w:val="0"/>
+        </w:rPr>
+        <w:t>The exercise grew in three stages, each answering a harder question than the last:</w:t>
       </w:r>
     </w:p>
     <w:p>
@@ -77,10 +90,10 @@
         <w:rPr>
           <w:b/>
         </w:rPr>
-        <w:t xml:space="preserve">Phase 1 (prior session): </w:t>
+        <w:t xml:space="preserve">Stage 1 — does it work at all, on something real? </w:t>
       </w:r>
       <w:r>
-        <w:t>research-only — read AWS’s documentation and blog posts and wrote up how the capability is described to work, without running anything.</w:t>
+        <w:t>One real Lambda function, deployed to AWS, upgraded from Node.js 18 to Node.js 24, invoked before and after to prove identical behavior.</w:t>
       </w:r>
     </w:p>
     <w:p>
@@ -91,28 +104,550 @@
         <w:rPr>
           <w:b/>
         </w:rPr>
-        <w:t xml:space="preserve">Phase 2 (this document): </w:t>
+        <w:t xml:space="preserve">Stage 2 — does it generalize across languages, locally? </w:t>
       </w:r>
       <w:r>
-        <w:t>a hands-on proof of concept — build a small real application, deploy it to a real AWS account on an old Node.js runtime, run AWS Transform’s managed transformation against it, and redeploy the result to prove the upgrade actually works end to end, not just on paper.</w:t>
+        <w:t>Three toy apps (Python, Java, Node.js), each upgraded and actually executed on the real local toolchain — no AWS deployment needed to prove this part.</w:t>
       </w:r>
     </w:p>
     <w:p>
+      <w:pPr>
+        <w:pStyle w:val="ListBullet"/>
+      </w:pPr>
       <w:r>
-        <w:t>The goal was narrow and deliberate: prove the capability works, with real evidence (a live AWS Lambda function, a real invoke response, a real code diff) — not simulate or describe it.</w:t>
+        <w:rPr>
+          <w:b/>
+        </w:rPr>
+        <w:t xml:space="preserve">Stage 3 — does it do real work, or just bump a version number? </w:t>
+      </w:r>
+      <w:r>
+        <w:t>Stage 2 revealed that two of the three languages had nothing genuinely broken to fix, so the transformation correctly did very little. Stage 3 deliberately built harder cases — a Java API actually removed in the target version, and a Python API actually deprecated with a real runtime warning — to see whether the tool finds and fixes real problems on its own, with no hints given about what the problem is.</w:t>
       </w:r>
     </w:p>
+    <w:p/>
+    <w:p>
+      <w:r>
+        <w:rPr>
+          <w:b/>
+          <w:i w:val="0"/>
+        </w:rPr>
+        <w:t>Summary of all six POCs:</w:t>
+      </w:r>
+    </w:p>
+    <w:tbl>
+      <w:tblPr>
+        <w:tblStyle w:val="LightGrid-Accent1"/>
+        <w:tblW w:type="auto" w:w="0"/>
+        <w:jc w:val="center"/>
+        <w:tblLook w:firstColumn="1" w:firstRow="1" w:lastColumn="0" w:lastRow="0" w:noHBand="0" w:noVBand="1" w:val="04A0"/>
+      </w:tblPr>
+      <w:tblGrid>
+        <w:gridCol w:w="1728"/>
+        <w:gridCol w:w="1728"/>
+        <w:gridCol w:w="1728"/>
+        <w:gridCol w:w="1728"/>
+        <w:gridCol w:w="1728"/>
+      </w:tblGrid>
+      <w:tr>
+        <w:tc>
+          <w:tcPr>
+            <w:tcW w:type="dxa" w:w="432"/>
+            <w:shd w:val="clear" w:color="auto" w:fill="2E5395"/>
+          </w:tcPr>
+          <w:p>
+            <w:r>
+              <w:rPr>
+                <w:b/>
+                <w:color w:val="FFFFFF"/>
+                <w:sz w:val="20"/>
+              </w:rPr>
+              <w:t>#</w:t>
+            </w:r>
+          </w:p>
+        </w:tc>
+        <w:tc>
+          <w:tcPr>
+            <w:tcW w:type="dxa" w:w="1872"/>
+            <w:shd w:val="clear" w:color="auto" w:fill="2E5395"/>
+          </w:tcPr>
+          <w:p>
+            <w:r>
+              <w:rPr>
+                <w:b/>
+                <w:color w:val="FFFFFF"/>
+                <w:sz w:val="20"/>
+              </w:rPr>
+              <w:t>Language</w:t>
+            </w:r>
+          </w:p>
+        </w:tc>
+        <w:tc>
+          <w:tcPr>
+            <w:tcW w:type="dxa" w:w="3168"/>
+            <w:shd w:val="clear" w:color="auto" w:fill="2E5395"/>
+          </w:tcPr>
+          <w:p>
+            <w:r>
+              <w:rPr>
+                <w:b/>
+                <w:color w:val="FFFFFF"/>
+                <w:sz w:val="20"/>
+              </w:rPr>
+              <w:t>What changed</w:t>
+            </w:r>
+          </w:p>
+        </w:tc>
+        <w:tc>
+          <w:tcPr>
+            <w:tcW w:type="dxa" w:w="2304"/>
+            <w:shd w:val="clear" w:color="auto" w:fill="2E5395"/>
+          </w:tcPr>
+          <w:p>
+            <w:r>
+              <w:rPr>
+                <w:b/>
+                <w:color w:val="FFFFFF"/>
+                <w:sz w:val="20"/>
+              </w:rPr>
+              <w:t>Real fix needed?</w:t>
+            </w:r>
+          </w:p>
+        </w:tc>
+        <w:tc>
+          <w:tcPr>
+            <w:tcW w:type="dxa" w:w="2448"/>
+            <w:shd w:val="clear" w:color="auto" w:fill="2E5395"/>
+          </w:tcPr>
+          <w:p>
+            <w:r>
+              <w:rPr>
+                <w:b/>
+                <w:color w:val="FFFFFF"/>
+                <w:sz w:val="20"/>
+              </w:rPr>
+              <w:t>Verified by</w:t>
+            </w:r>
+          </w:p>
+        </w:tc>
+      </w:tr>
+      <w:tr>
+        <w:tc>
+          <w:tcPr>
+            <w:tcW w:type="dxa" w:w="432"/>
+          </w:tcPr>
+          <w:p>
+            <w:r>
+              <w:rPr>
+                <w:sz w:val="20"/>
+              </w:rPr>
+              <w:t>1</w:t>
+            </w:r>
+          </w:p>
+        </w:tc>
+        <w:tc>
+          <w:tcPr>
+            <w:tcW w:type="dxa" w:w="1872"/>
+          </w:tcPr>
+          <w:p>
+            <w:r>
+              <w:rPr>
+                <w:sz w:val="20"/>
+              </w:rPr>
+              <w:t>Node.js (Lambda)</w:t>
+            </w:r>
+          </w:p>
+        </w:tc>
+        <w:tc>
+          <w:tcPr>
+            <w:tcW w:type="dxa" w:w="3168"/>
+          </w:tcPr>
+          <w:p>
+            <w:r>
+              <w:rPr>
+                <w:sz w:val="20"/>
+              </w:rPr>
+              <w:t>Runtime 18 → 24, callback → async/await</w:t>
+            </w:r>
+          </w:p>
+        </w:tc>
+        <w:tc>
+          <w:tcPr>
+            <w:tcW w:type="dxa" w:w="2304"/>
+          </w:tcPr>
+          <w:p>
+            <w:r>
+              <w:rPr>
+                <w:sz w:val="20"/>
+              </w:rPr>
+              <w:t>Yes (code style + Lambda RIC compat)</w:t>
+            </w:r>
+          </w:p>
+        </w:tc>
+        <w:tc>
+          <w:tcPr>
+            <w:tcW w:type="dxa" w:w="2448"/>
+          </w:tcPr>
+          <w:p>
+            <w:r>
+              <w:rPr>
+                <w:sz w:val="20"/>
+              </w:rPr>
+              <w:t>Live AWS invoke, before/after identical</w:t>
+            </w:r>
+          </w:p>
+        </w:tc>
+      </w:tr>
+      <w:tr>
+        <w:tc>
+          <w:tcPr>
+            <w:tcW w:type="dxa" w:w="432"/>
+          </w:tcPr>
+          <w:p>
+            <w:r>
+              <w:rPr>
+                <w:sz w:val="20"/>
+              </w:rPr>
+              <w:t>2</w:t>
+            </w:r>
+          </w:p>
+        </w:tc>
+        <w:tc>
+          <w:tcPr>
+            <w:tcW w:type="dxa" w:w="1872"/>
+          </w:tcPr>
+          <w:p>
+            <w:r>
+              <w:rPr>
+                <w:sz w:val="20"/>
+              </w:rPr>
+              <w:t>Python</w:t>
+            </w:r>
+          </w:p>
+        </w:tc>
+        <w:tc>
+          <w:tcPr>
+            <w:tcW w:type="dxa" w:w="3168"/>
+          </w:tcPr>
+          <w:p>
+            <w:r>
+              <w:rPr>
+                <w:sz w:val="20"/>
+              </w:rPr>
+              <w:t>Typing style, 3.8-style → 3.13</w:t>
+            </w:r>
+          </w:p>
+        </w:tc>
+        <w:tc>
+          <w:tcPr>
+            <w:tcW w:type="dxa" w:w="2304"/>
+          </w:tcPr>
+          <w:p>
+            <w:r>
+              <w:rPr>
+                <w:sz w:val="20"/>
+              </w:rPr>
+              <w:t>No — cosmetic only</w:t>
+            </w:r>
+          </w:p>
+        </w:tc>
+        <w:tc>
+          <w:tcPr>
+            <w:tcW w:type="dxa" w:w="2448"/>
+          </w:tcPr>
+          <w:p>
+            <w:r>
+              <w:rPr>
+                <w:sz w:val="20"/>
+              </w:rPr>
+              <w:t>Local execution</w:t>
+            </w:r>
+          </w:p>
+        </w:tc>
+      </w:tr>
+      <w:tr>
+        <w:tc>
+          <w:tcPr>
+            <w:tcW w:type="dxa" w:w="432"/>
+          </w:tcPr>
+          <w:p>
+            <w:r>
+              <w:rPr>
+                <w:sz w:val="20"/>
+              </w:rPr>
+              <w:t>3</w:t>
+            </w:r>
+          </w:p>
+        </w:tc>
+        <w:tc>
+          <w:tcPr>
+            <w:tcW w:type="dxa" w:w="1872"/>
+          </w:tcPr>
+          <w:p>
+            <w:r>
+              <w:rPr>
+                <w:sz w:val="20"/>
+              </w:rPr>
+              <w:t>Java</w:t>
+            </w:r>
+          </w:p>
+        </w:tc>
+        <w:tc>
+          <w:tcPr>
+            <w:tcW w:type="dxa" w:w="3168"/>
+          </w:tcPr>
+          <w:p>
+            <w:r>
+              <w:rPr>
+                <w:sz w:val="20"/>
+              </w:rPr>
+              <w:t>Compiler release 8 → 17</w:t>
+            </w:r>
+          </w:p>
+        </w:tc>
+        <w:tc>
+          <w:tcPr>
+            <w:tcW w:type="dxa" w:w="2304"/>
+          </w:tcPr>
+          <w:p>
+            <w:r>
+              <w:rPr>
+                <w:sz w:val="20"/>
+              </w:rPr>
+              <w:t>No — property bump only</w:t>
+            </w:r>
+          </w:p>
+        </w:tc>
+        <w:tc>
+          <w:tcPr>
+            <w:tcW w:type="dxa" w:w="2448"/>
+          </w:tcPr>
+          <w:p>
+            <w:r>
+              <w:rPr>
+                <w:sz w:val="20"/>
+              </w:rPr>
+              <w:t>Local execution</w:t>
+            </w:r>
+          </w:p>
+        </w:tc>
+      </w:tr>
+      <w:tr>
+        <w:tc>
+          <w:tcPr>
+            <w:tcW w:type="dxa" w:w="432"/>
+          </w:tcPr>
+          <w:p>
+            <w:r>
+              <w:rPr>
+                <w:sz w:val="20"/>
+              </w:rPr>
+              <w:t>4</w:t>
+            </w:r>
+          </w:p>
+        </w:tc>
+        <w:tc>
+          <w:tcPr>
+            <w:tcW w:type="dxa" w:w="1872"/>
+          </w:tcPr>
+          <w:p>
+            <w:r>
+              <w:rPr>
+                <w:sz w:val="20"/>
+              </w:rPr>
+              <w:t>Node.js (general)</w:t>
+            </w:r>
+          </w:p>
+        </w:tc>
+        <w:tc>
+          <w:tcPr>
+            <w:tcW w:type="dxa" w:w="3168"/>
+          </w:tcPr>
+          <w:p>
+            <w:r>
+              <w:rPr>
+                <w:sz w:val="20"/>
+              </w:rPr>
+              <w:t>var/new Buffer() → let/Buffer.from()</w:t>
+            </w:r>
+          </w:p>
+        </w:tc>
+        <w:tc>
+          <w:tcPr>
+            <w:tcW w:type="dxa" w:w="2304"/>
+          </w:tcPr>
+          <w:p>
+            <w:r>
+              <w:rPr>
+                <w:sz w:val="20"/>
+              </w:rPr>
+              <w:t>Partial — one real deprecated API</w:t>
+            </w:r>
+          </w:p>
+        </w:tc>
+        <w:tc>
+          <w:tcPr>
+            <w:tcW w:type="dxa" w:w="2448"/>
+          </w:tcPr>
+          <w:p>
+            <w:r>
+              <w:rPr>
+                <w:sz w:val="20"/>
+              </w:rPr>
+              <w:t>Local execution, warning confirmed gone</w:t>
+            </w:r>
+          </w:p>
+        </w:tc>
+      </w:tr>
+      <w:tr>
+        <w:tc>
+          <w:tcPr>
+            <w:tcW w:type="dxa" w:w="432"/>
+          </w:tcPr>
+          <w:p>
+            <w:r>
+              <w:rPr>
+                <w:sz w:val="20"/>
+              </w:rPr>
+              <w:t>5</w:t>
+            </w:r>
+          </w:p>
+        </w:tc>
+        <w:tc>
+          <w:tcPr>
+            <w:tcW w:type="dxa" w:w="1872"/>
+          </w:tcPr>
+          <w:p>
+            <w:r>
+              <w:rPr>
+                <w:sz w:val="20"/>
+              </w:rPr>
+              <w:t>Java (harder case)</w:t>
+            </w:r>
+          </w:p>
+        </w:tc>
+        <w:tc>
+          <w:tcPr>
+            <w:tcW w:type="dxa" w:w="3168"/>
+          </w:tcPr>
+          <w:p>
+            <w:r>
+              <w:rPr>
+                <w:sz w:val="20"/>
+              </w:rPr>
+              <w:t>java.rmi.activation removed in JDK 17</w:t>
+            </w:r>
+          </w:p>
+        </w:tc>
+        <w:tc>
+          <w:tcPr>
+            <w:tcW w:type="dxa" w:w="2304"/>
+          </w:tcPr>
+          <w:p>
+            <w:r>
+              <w:rPr>
+                <w:sz w:val="20"/>
+              </w:rPr>
+              <w:t>Yes — genuine compile break</w:t>
+            </w:r>
+          </w:p>
+        </w:tc>
+        <w:tc>
+          <w:tcPr>
+            <w:tcW w:type="dxa" w:w="2448"/>
+          </w:tcPr>
+          <w:p>
+            <w:r>
+              <w:rPr>
+                <w:sz w:val="20"/>
+              </w:rPr>
+              <w:t>Local execution, empirically proven break/fix</w:t>
+            </w:r>
+          </w:p>
+        </w:tc>
+      </w:tr>
+      <w:tr>
+        <w:tc>
+          <w:tcPr>
+            <w:tcW w:type="dxa" w:w="432"/>
+          </w:tcPr>
+          <w:p>
+            <w:r>
+              <w:rPr>
+                <w:sz w:val="20"/>
+              </w:rPr>
+              <w:t>6</w:t>
+            </w:r>
+          </w:p>
+        </w:tc>
+        <w:tc>
+          <w:tcPr>
+            <w:tcW w:type="dxa" w:w="1872"/>
+          </w:tcPr>
+          <w:p>
+            <w:r>
+              <w:rPr>
+                <w:sz w:val="20"/>
+              </w:rPr>
+              <w:t>Python (harder case)</w:t>
+            </w:r>
+          </w:p>
+        </w:tc>
+        <w:tc>
+          <w:tcPr>
+            <w:tcW w:type="dxa" w:w="3168"/>
+          </w:tcPr>
+          <w:p>
+            <w:r>
+              <w:rPr>
+                <w:sz w:val="20"/>
+              </w:rPr>
+              <w:t>datetime.utcnow() deprecated since 3.12</w:t>
+            </w:r>
+          </w:p>
+        </w:tc>
+        <w:tc>
+          <w:tcPr>
+            <w:tcW w:type="dxa" w:w="2304"/>
+          </w:tcPr>
+          <w:p>
+            <w:r>
+              <w:rPr>
+                <w:sz w:val="20"/>
+              </w:rPr>
+              <w:t>Yes — genuine runtime warning</w:t>
+            </w:r>
+          </w:p>
+        </w:tc>
+        <w:tc>
+          <w:tcPr>
+            <w:tcW w:type="dxa" w:w="2448"/>
+          </w:tcPr>
+          <w:p>
+            <w:r>
+              <w:rPr>
+                <w:sz w:val="20"/>
+              </w:rPr>
+              <w:t>Local execution, warning confirmed gone</w:t>
+            </w:r>
+          </w:p>
+        </w:tc>
+      </w:tr>
+    </w:tbl>
+    <w:p/>
     <w:p>
       <w:pPr>
         <w:pStyle w:val="Heading1"/>
       </w:pPr>
       <w:r>
-        <w:t>2. Application Under Test</w:t>
+        <w:t>2. Stage 1 — AWS Lambda (Node.js), Deployed to Real AWS</w:t>
       </w:r>
     </w:p>
     <w:p>
+      <w:pPr>
+        <w:pStyle w:val="Heading2"/>
+      </w:pPr>
       <w:r>
-        <w:t>A minimal, purpose-built AWS Lambda function — small enough that every change AWS Transform made could be reviewed line by line, but structured exactly the way AWS’s own worked example describes a pre-upgrade Node.js Lambda handler: written in the older callback style rather than modern async/await.</w:t>
+        <w:t>2.1 Application under test</w:t>
       </w:r>
     </w:p>
     <w:tbl>
@@ -156,7 +691,7 @@
                 <w:color w:val="FFFFFF"/>
                 <w:sz w:val="20"/>
               </w:rPr>
-              <w:t>Before (starting state)</w:t>
+              <w:t>Before</w:t>
             </w:r>
           </w:p>
         </w:tc>
@@ -172,48 +707,7 @@
                 <w:color w:val="FFFFFF"/>
                 <w:sz w:val="20"/>
               </w:rPr>
-              <w:t>After (upgraded state)</w:t>
-            </w:r>
-          </w:p>
-        </w:tc>
-      </w:tr>
-      <w:tr>
-        <w:tc>
-          <w:tcPr>
-            <w:tcW w:type="dxa" w:w="2592"/>
-          </w:tcPr>
-          <w:p>
-            <w:r>
-              <w:rPr>
-                <w:sz w:val="20"/>
-              </w:rPr>
-              <w:t>Application</w:t>
-            </w:r>
-          </w:p>
-        </w:tc>
-        <w:tc>
-          <w:tcPr>
-            <w:tcW w:type="dxa" w:w="3312"/>
-          </w:tcPr>
-          <w:p>
-            <w:r>
-              <w:rPr>
-                <w:sz w:val="20"/>
-              </w:rPr>
-              <w:t>atx-poc-lambda (toy Lambda handler)</w:t>
-            </w:r>
-          </w:p>
-        </w:tc>
-        <w:tc>
-          <w:tcPr>
-            <w:tcW w:type="dxa" w:w="3312"/>
-          </w:tcPr>
-          <w:p>
-            <w:r>
-              <w:rPr>
-                <w:sz w:val="20"/>
-              </w:rPr>
-              <w:t>same application, same function</w:t>
+              <w:t>After</w:t>
             </w:r>
           </w:p>
         </w:tc>
@@ -282,7 +776,7 @@
               <w:rPr>
                 <w:sz w:val="20"/>
               </w:rPr>
-              <w:t>Callback-style: function(event, context, callback)</w:t>
+              <w:t>Callback: function(event, context, callback)</w:t>
             </w:r>
           </w:p>
         </w:tc>
@@ -310,7 +804,7 @@
               <w:rPr>
                 <w:sz w:val="20"/>
               </w:rPr>
-              <w:t>package.json "engines.node"</w:t>
+              <w:t>package.json engines.node</w:t>
             </w:r>
           </w:p>
         </w:tc>
@@ -351,48 +845,7 @@
               <w:rPr>
                 <w:sz w:val="20"/>
               </w:rPr>
-              <w:t>AWS Lambda function name</w:t>
-            </w:r>
-          </w:p>
-        </w:tc>
-        <w:tc>
-          <w:tcPr>
-            <w:tcW w:type="dxa" w:w="3312"/>
-          </w:tcPr>
-          <w:p>
-            <w:r>
-              <w:rPr>
-                <w:sz w:val="20"/>
-              </w:rPr>
-              <w:t>atx-poc-lambda-runtime-upgrade</w:t>
-            </w:r>
-          </w:p>
-        </w:tc>
-        <w:tc>
-          <w:tcPr>
-            <w:tcW w:type="dxa" w:w="3312"/>
-          </w:tcPr>
-          <w:p>
-            <w:r>
-              <w:rPr>
-                <w:sz w:val="20"/>
-              </w:rPr>
-              <w:t>atx-poc-lambda-runtime-upgrade (same function, redeployed)</w:t>
-            </w:r>
-          </w:p>
-        </w:tc>
-      </w:tr>
-      <w:tr>
-        <w:tc>
-          <w:tcPr>
-            <w:tcW w:type="dxa" w:w="2592"/>
-          </w:tcPr>
-          <w:p>
-            <w:r>
-              <w:rPr>
-                <w:sz w:val="20"/>
-              </w:rPr>
-              <w:t>Behavior (invoke response)</w:t>
+              <w:t>Invoke response</w:t>
             </w:r>
           </w:p>
         </w:tc>
@@ -418,7 +871,215 @@
               <w:rPr>
                 <w:sz w:val="20"/>
               </w:rPr>
-              <w:t>{"message":"Hello, AWS Transform!"} (identical)</w:t>
+              <w:t>identical</w:t>
+            </w:r>
+          </w:p>
+        </w:tc>
+      </w:tr>
+    </w:tbl>
+    <w:p/>
+    <w:p>
+      <w:pPr>
+        <w:pStyle w:val="Heading2"/>
+      </w:pPr>
+      <w:r>
+        <w:t>2.2 Steps</w:t>
+      </w:r>
+    </w:p>
+    <w:p>
+      <w:r>
+        <w:rPr>
+          <w:b w:val="0"/>
+          <w:i w:val="0"/>
+        </w:rPr>
+        <w:t>1. Installed atx (v3.11.0) via the official install script; confirmed real CLI flags with --help before trusting any documentation examples.</w:t>
+      </w:r>
+    </w:p>
+    <w:p>
+      <w:r>
+        <w:rPr>
+          <w:b w:val="0"/>
+          <w:i w:val="0"/>
+        </w:rPr>
+        <w:t>2. Built the toy handler in old callback style, plus a local test harness that tolerates both callback- and Promise-returning handlers without editing.</w:t>
+      </w:r>
+    </w:p>
+    <w:p>
+      <w:r>
+        <w:rPr>
+          <w:b w:val="0"/>
+          <w:i w:val="0"/>
+        </w:rPr>
+        <w:t>3. Deployed to real AWS Lambda on nodejs18.x (a dedicated least-privilege IAM role, AWSLambdaBasicExecutionRole only). Invoked it, saved the response as a baseline.</w:t>
+      </w:r>
+    </w:p>
+    <w:p>
+      <w:r>
+        <w:rPr>
+          <w:b w:val="0"/>
+          <w:i w:val="0"/>
+        </w:rPr>
+        <w:t>4. Ran AWS Transform’s managed AWS/lambda-nodejs-runtime-upgrade transformation, targeting Node.js 24. Two real gaps found only by running it: atx needs an explicit --build-command (no auto-detection), and unattended runs need --non-interactive --trust-all-tools.</w:t>
+      </w:r>
+    </w:p>
+    <w:p>
+      <w:r>
+        <w:rPr>
+          <w:b w:val="0"/>
+          <w:i w:val="0"/>
+        </w:rPr>
+        <w:t>5. Independently reviewed the diff and re-ran the test — did not just trust atx’s own "Build status: Success" report.</w:t>
+      </w:r>
+    </w:p>
+    <w:p>
+      <w:r>
+        <w:rPr>
+          <w:b w:val="0"/>
+          <w:i w:val="0"/>
+        </w:rPr>
+        <w:t>6. Merged, redeployed the SAME Lambda function on nodejs24.x, invoked again.</w:t>
+      </w:r>
+    </w:p>
+    <w:tbl>
+      <w:tblPr>
+        <w:tblStyle w:val="LightGrid-Accent1"/>
+        <w:tblW w:type="auto" w:w="0"/>
+        <w:jc w:val="center"/>
+        <w:tblLook w:firstColumn="1" w:firstRow="1" w:lastColumn="0" w:lastRow="0" w:noHBand="0" w:noVBand="1" w:val="04A0"/>
+      </w:tblPr>
+      <w:tblGrid>
+        <w:gridCol w:w="2880"/>
+        <w:gridCol w:w="2880"/>
+        <w:gridCol w:w="2880"/>
+      </w:tblGrid>
+      <w:tr>
+        <w:tc>
+          <w:tcPr>
+            <w:tcW w:type="dxa" w:w="3600"/>
+            <w:shd w:val="clear" w:color="auto" w:fill="2E5395"/>
+          </w:tcPr>
+          <w:p>
+            <w:r>
+              <w:rPr>
+                <w:b/>
+                <w:color w:val="FFFFFF"/>
+                <w:sz w:val="20"/>
+              </w:rPr>
+              <w:t>Check</w:t>
+            </w:r>
+          </w:p>
+        </w:tc>
+        <w:tc>
+          <w:tcPr>
+            <w:tcW w:type="dxa" w:w="2880"/>
+            <w:shd w:val="clear" w:color="auto" w:fill="2E5395"/>
+          </w:tcPr>
+          <w:p>
+            <w:r>
+              <w:rPr>
+                <w:b/>
+                <w:color w:val="FFFFFF"/>
+                <w:sz w:val="20"/>
+              </w:rPr>
+              <w:t>Before</w:t>
+            </w:r>
+          </w:p>
+        </w:tc>
+        <w:tc>
+          <w:tcPr>
+            <w:tcW w:type="dxa" w:w="2880"/>
+            <w:shd w:val="clear" w:color="auto" w:fill="2E5395"/>
+          </w:tcPr>
+          <w:p>
+            <w:r>
+              <w:rPr>
+                <w:b/>
+                <w:color w:val="FFFFFF"/>
+                <w:sz w:val="20"/>
+              </w:rPr>
+              <w:t>After</w:t>
+            </w:r>
+          </w:p>
+        </w:tc>
+      </w:tr>
+      <w:tr>
+        <w:tc>
+          <w:tcPr>
+            <w:tcW w:type="dxa" w:w="3600"/>
+          </w:tcPr>
+          <w:p>
+            <w:r>
+              <w:rPr>
+                <w:sz w:val="20"/>
+              </w:rPr>
+              <w:t>Runtime</w:t>
+            </w:r>
+          </w:p>
+        </w:tc>
+        <w:tc>
+          <w:tcPr>
+            <w:tcW w:type="dxa" w:w="2880"/>
+          </w:tcPr>
+          <w:p>
+            <w:r>
+              <w:rPr>
+                <w:sz w:val="20"/>
+              </w:rPr>
+              <w:t>nodejs18.x</w:t>
+            </w:r>
+          </w:p>
+        </w:tc>
+        <w:tc>
+          <w:tcPr>
+            <w:tcW w:type="dxa" w:w="2880"/>
+          </w:tcPr>
+          <w:p>
+            <w:r>
+              <w:rPr>
+                <w:sz w:val="20"/>
+              </w:rPr>
+              <w:t>nodejs24.x</w:t>
+            </w:r>
+          </w:p>
+        </w:tc>
+      </w:tr>
+      <w:tr>
+        <w:tc>
+          <w:tcPr>
+            <w:tcW w:type="dxa" w:w="3600"/>
+          </w:tcPr>
+          <w:p>
+            <w:r>
+              <w:rPr>
+                <w:sz w:val="20"/>
+              </w:rPr>
+              <w:t>Invoke response</w:t>
+            </w:r>
+          </w:p>
+        </w:tc>
+        <w:tc>
+          <w:tcPr>
+            <w:tcW w:type="dxa" w:w="2880"/>
+          </w:tcPr>
+          <w:p>
+            <w:r>
+              <w:rPr>
+                <w:sz w:val="20"/>
+              </w:rPr>
+              <w:t>identical</w:t>
+            </w:r>
+          </w:p>
+        </w:tc>
+        <w:tc>
+          <w:tcPr>
+            <w:tcW w:type="dxa" w:w="2880"/>
+          </w:tcPr>
+          <w:p>
+            <w:r>
+              <w:rPr>
+                <w:sz w:val="20"/>
+              </w:rPr>
+              <w:t>identical</w:t>
             </w:r>
           </w:p>
         </w:tc>
@@ -427,7 +1088,37 @@
     <w:p/>
     <w:p>
       <w:r>
-        <w:t>What the function does is intentionally trivial (it takes a name from the input event and returns a greeting) — the point of the exercise was not the business logic, it was proving that AWS Transform can take a real, deployed, callback-style Lambda on an old runtime and produce a working async/await version on a new runtime, automatically.</w:t>
+        <w:rPr>
+          <w:b w:val="0"/>
+          <w:i w:val="0"/>
+        </w:rPr>
+        <w:t>7. Cleaned up: deleted the real Lambda function and IAM role once results were captured.</w:t>
+      </w:r>
+    </w:p>
+    <w:p>
+      <w:r>
+        <w:rPr>
+          <w:b w:val="0"/>
+          <w:i/>
+        </w:rPr>
+        <w:t>Agent Minutes used: 15.13.</w:t>
+      </w:r>
+    </w:p>
+    <w:p>
+      <w:pPr>
+        <w:pStyle w:val="Heading1"/>
+      </w:pPr>
+      <w:r>
+        <w:t>3. Stage 2 — Multi-Language, Local (First Pass)</w:t>
+      </w:r>
+    </w:p>
+    <w:p>
+      <w:r>
+        <w:rPr>
+          <w:b w:val="0"/>
+          <w:i w:val="0"/>
+        </w:rPr>
+        <w:t>Same method, no AWS deployment this time — the code is transformed and then actually executed with the real local Python/Java/Node.js toolchain as proof, not just diffed. Target versions were chosen so the "after" code could genuinely run on what’s installed locally (Python 3.14.5, JDK 17/Corretto + Maven, Node.js v26.4.0).</w:t>
       </w:r>
     </w:p>
     <w:p>
@@ -435,7 +1126,7 @@
         <w:pStyle w:val="Heading2"/>
       </w:pPr>
       <w:r>
-        <w:t>2.1 The "before" handler code</w:t>
+        <w:t>3.1 Python — AWS/python-version-upgrade (3.8-style → 3.13)</w:t>
       </w:r>
     </w:p>
     <w:p>
@@ -450,7 +1141,18 @@
           <w:color w:val="1A1A1A"/>
           <w:sz w:val="18"/>
         </w:rPr>
-        <w:t>'use strict';</w:t>
+        <w:t># Before</w:t>
+      </w:r>
+      <w:r>
+        <w:br/>
+      </w:r>
+      <w:r>
+        <w:rPr>
+          <w:rFonts w:ascii="Consolas" w:hAnsi="Consolas"/>
+          <w:color w:val="1A1A1A"/>
+          <w:sz w:val="18"/>
+        </w:rPr>
+        <w:t>from typing import Dict, Optional</w:t>
       </w:r>
       <w:r>
         <w:br/>
@@ -472,7 +1174,7 @@
           <w:color w:val="1A1A1A"/>
           <w:sz w:val="18"/>
         </w:rPr>
-        <w:t>exports.handler = function (event, context, callback) {</w:t>
+        <w:t>def greet(name: Optional[str]) -&gt; Dict[str, str]:</w:t>
       </w:r>
       <w:r>
         <w:br/>
@@ -483,7 +1185,7 @@
           <w:color w:val="1A1A1A"/>
           <w:sz w:val="18"/>
         </w:rPr>
-        <w:t xml:space="preserve">  const name = (event &amp;&amp; event.name) || 'world';</w:t>
+        <w:t xml:space="preserve">    display_name = name if name else "world"</w:t>
       </w:r>
       <w:r>
         <w:br/>
@@ -494,41 +1196,7 @@
           <w:color w:val="1A1A1A"/>
           <w:sz w:val="18"/>
         </w:rPr>
-        <w:t xml:space="preserve">  callback(null, { message: `Hello, ${name}!` });</w:t>
-      </w:r>
-      <w:r>
-        <w:br/>
-      </w:r>
-      <w:r>
-        <w:rPr>
-          <w:rFonts w:ascii="Consolas" w:hAnsi="Consolas"/>
-          <w:color w:val="1A1A1A"/>
-          <w:sz w:val="18"/>
-        </w:rPr>
-        <w:t>};</w:t>
-      </w:r>
-    </w:p>
-    <w:p>
-      <w:pPr>
-        <w:pStyle w:val="Heading2"/>
-      </w:pPr>
-      <w:r>
-        <w:t>2.2 The "after" handler code (produced by AWS Transform)</w:t>
-      </w:r>
-    </w:p>
-    <w:p>
-      <w:pPr>
-        <w:spacing w:before="80" w:after="160"/>
-        <w:ind w:left="360"/>
-        <w:shd w:val="clear" w:color="auto" w:fill="F2F2F2"/>
-      </w:pPr>
-      <w:r>
-        <w:rPr>
-          <w:rFonts w:ascii="Consolas" w:hAnsi="Consolas"/>
-          <w:color w:val="1A1A1A"/>
-          <w:sz w:val="18"/>
-        </w:rPr>
-        <w:t>'use strict';</w:t>
+        <w:t xml:space="preserve">    return {"message": "Hello, {}!".format(display_name)}</w:t>
       </w:r>
       <w:r>
         <w:br/>
@@ -550,7 +1218,7 @@
           <w:color w:val="1A1A1A"/>
           <w:sz w:val="18"/>
         </w:rPr>
-        <w:t>exports.handler = async function (event, context) {</w:t>
+        <w:t># After (produced by AWS Transform)</w:t>
       </w:r>
       <w:r>
         <w:br/>
@@ -561,7 +1229,7 @@
           <w:color w:val="1A1A1A"/>
           <w:sz w:val="18"/>
         </w:rPr>
-        <w:t xml:space="preserve">  const name = (event &amp;&amp; event.name) || 'world';</w:t>
+        <w:t>def greet(name: str | None) -&gt; dict[str, str]:</w:t>
       </w:r>
       <w:r>
         <w:br/>
@@ -572,7 +1240,7 @@
           <w:color w:val="1A1A1A"/>
           <w:sz w:val="18"/>
         </w:rPr>
-        <w:t xml:space="preserve">  return { message: `Hello, ${name}!` };</w:t>
+        <w:t xml:space="preserve">    display_name = name if name else "world"</w:t>
       </w:r>
       <w:r>
         <w:br/>
@@ -583,276 +1251,16 @@
           <w:color w:val="1A1A1A"/>
           <w:sz w:val="18"/>
         </w:rPr>
-        <w:t>};</w:t>
+        <w:t xml:space="preserve">    return {"message": f"Hello, {display_name}!"}</w:t>
       </w:r>
     </w:p>
     <w:p>
       <w:r>
-        <w:t>AWS Transform correctly identified that the callback parameter could be dropped, the handler declaration needed the async keyword, and callback(null, result) needed to become a plain return statement — exactly the transformation pattern AWS documents for Lambda Node.js runtime upgrades.</w:t>
-      </w:r>
-    </w:p>
-    <w:p>
-      <w:pPr>
-        <w:pStyle w:val="Heading1"/>
-      </w:pPr>
-      <w:r>
-        <w:t>3. Environment and Prerequisites</w:t>
-      </w:r>
-    </w:p>
-    <w:tbl>
-      <w:tblPr>
-        <w:tblStyle w:val="LightGrid-Accent1"/>
-        <w:tblW w:type="auto" w:w="0"/>
-        <w:jc w:val="center"/>
-        <w:tblLook w:firstColumn="1" w:firstRow="1" w:lastColumn="0" w:lastRow="0" w:noHBand="0" w:noVBand="1" w:val="04A0"/>
-      </w:tblPr>
-      <w:tblGrid>
-        <w:gridCol w:w="4320"/>
-        <w:gridCol w:w="4320"/>
-      </w:tblGrid>
-      <w:tr>
-        <w:tc>
-          <w:tcPr>
-            <w:tcW w:type="dxa" w:w="3168"/>
-            <w:shd w:val="clear" w:color="auto" w:fill="2E5395"/>
-          </w:tcPr>
-          <w:p>
-            <w:r>
-              <w:rPr>
-                <w:b/>
-                <w:color w:val="FFFFFF"/>
-                <w:sz w:val="20"/>
-              </w:rPr>
-              <w:t>Item</w:t>
-            </w:r>
-          </w:p>
-        </w:tc>
-        <w:tc>
-          <w:tcPr>
-            <w:tcW w:type="dxa" w:w="6048"/>
-            <w:shd w:val="clear" w:color="auto" w:fill="2E5395"/>
-          </w:tcPr>
-          <w:p>
-            <w:r>
-              <w:rPr>
-                <w:b/>
-                <w:color w:val="FFFFFF"/>
-                <w:sz w:val="20"/>
-              </w:rPr>
-              <w:t>Value</w:t>
-            </w:r>
-          </w:p>
-        </w:tc>
-      </w:tr>
-      <w:tr>
-        <w:tc>
-          <w:tcPr>
-            <w:tcW w:type="dxa" w:w="3168"/>
-          </w:tcPr>
-          <w:p>
-            <w:r>
-              <w:rPr>
-                <w:sz w:val="20"/>
-              </w:rPr>
-              <w:t>AWS Account</w:t>
-            </w:r>
-          </w:p>
-        </w:tc>
-        <w:tc>
-          <w:tcPr>
-            <w:tcW w:type="dxa" w:w="6048"/>
-          </w:tcPr>
-          <w:p>
-            <w:r>
-              <w:rPr>
-                <w:sz w:val="20"/>
-              </w:rPr>
-              <w:t>043309363336 (personal AWS learning account)</w:t>
-            </w:r>
-          </w:p>
-        </w:tc>
-      </w:tr>
-      <w:tr>
-        <w:tc>
-          <w:tcPr>
-            <w:tcW w:type="dxa" w:w="3168"/>
-          </w:tcPr>
-          <w:p>
-            <w:r>
-              <w:rPr>
-                <w:sz w:val="20"/>
-              </w:rPr>
-              <w:t>AWS Region</w:t>
-            </w:r>
-          </w:p>
-        </w:tc>
-        <w:tc>
-          <w:tcPr>
-            <w:tcW w:type="dxa" w:w="6048"/>
-          </w:tcPr>
-          <w:p>
-            <w:r>
-              <w:rPr>
-                <w:sz w:val="20"/>
-              </w:rPr>
-              <w:t>us-east-1</w:t>
-            </w:r>
-          </w:p>
-        </w:tc>
-      </w:tr>
-      <w:tr>
-        <w:tc>
-          <w:tcPr>
-            <w:tcW w:type="dxa" w:w="3168"/>
-          </w:tcPr>
-          <w:p>
-            <w:r>
-              <w:rPr>
-                <w:sz w:val="20"/>
-              </w:rPr>
-              <w:t>AWS CLI profile used</w:t>
-            </w:r>
-          </w:p>
-        </w:tc>
-        <w:tc>
-          <w:tcPr>
-            <w:tcW w:type="dxa" w:w="6048"/>
-          </w:tcPr>
-          <w:p>
-            <w:r>
-              <w:rPr>
-                <w:sz w:val="20"/>
-              </w:rPr>
-              <w:t>default (IAM Identity Center / SSO role, AdministratorAccess)</w:t>
-            </w:r>
-          </w:p>
-        </w:tc>
-      </w:tr>
-      <w:tr>
-        <w:tc>
-          <w:tcPr>
-            <w:tcW w:type="dxa" w:w="3168"/>
-          </w:tcPr>
-          <w:p>
-            <w:r>
-              <w:rPr>
-                <w:sz w:val="20"/>
-              </w:rPr>
-              <w:t>atx CLI version</w:t>
-            </w:r>
-          </w:p>
-        </w:tc>
-        <w:tc>
-          <w:tcPr>
-            <w:tcW w:type="dxa" w:w="6048"/>
-          </w:tcPr>
-          <w:p>
-            <w:r>
-              <w:rPr>
-                <w:sz w:val="20"/>
-              </w:rPr>
-              <w:t>3.11.0</w:t>
-            </w:r>
-          </w:p>
-        </w:tc>
-      </w:tr>
-      <w:tr>
-        <w:tc>
-          <w:tcPr>
-            <w:tcW w:type="dxa" w:w="3168"/>
-          </w:tcPr>
-          <w:p>
-            <w:r>
-              <w:rPr>
-                <w:sz w:val="20"/>
-              </w:rPr>
-              <w:t>atx install method</w:t>
-            </w:r>
-          </w:p>
-        </w:tc>
-        <w:tc>
-          <w:tcPr>
-            <w:tcW w:type="dxa" w:w="6048"/>
-          </w:tcPr>
-          <w:p>
-            <w:r>
-              <w:rPr>
-                <w:sz w:val="20"/>
-              </w:rPr>
-              <w:t>Official install script (transform-cli.awsstatic.com/install.sh)</w:t>
-            </w:r>
-          </w:p>
-        </w:tc>
-      </w:tr>
-      <w:tr>
-        <w:tc>
-          <w:tcPr>
-            <w:tcW w:type="dxa" w:w="3168"/>
-          </w:tcPr>
-          <w:p>
-            <w:r>
-              <w:rPr>
-                <w:sz w:val="20"/>
-              </w:rPr>
-              <w:t>Node.js (local machine)</w:t>
-            </w:r>
-          </w:p>
-        </w:tc>
-        <w:tc>
-          <w:tcPr>
-            <w:tcW w:type="dxa" w:w="6048"/>
-          </w:tcPr>
-          <w:p>
-            <w:r>
-              <w:rPr>
-                <w:sz w:val="20"/>
-              </w:rPr>
-              <w:t>v26.4.0</w:t>
-            </w:r>
-          </w:p>
-        </w:tc>
-      </w:tr>
-      <w:tr>
-        <w:tc>
-          <w:tcPr>
-            <w:tcW w:type="dxa" w:w="3168"/>
-          </w:tcPr>
-          <w:p>
-            <w:r>
-              <w:rPr>
-                <w:sz w:val="20"/>
-              </w:rPr>
-              <w:t>Transformation used</w:t>
-            </w:r>
-          </w:p>
-        </w:tc>
-        <w:tc>
-          <w:tcPr>
-            <w:tcW w:type="dxa" w:w="6048"/>
-          </w:tcPr>
-          <w:p>
-            <w:r>
-              <w:rPr>
-                <w:sz w:val="20"/>
-              </w:rPr>
-              <w:t>AWS/lambda-nodejs-runtime-upgrade (AWS-managed — not a custom-authored transformation)</w:t>
-            </w:r>
-          </w:p>
-        </w:tc>
-      </w:tr>
-    </w:tbl>
-    <w:p/>
-    <w:p>
-      <w:r>
-        <w:t>Using an AWS-managed transformation (as opposed to a custom one) means the "Define Transformation" phase of AWS Transform’s workflow was skipped entirely — no SKILL.md authoring was needed. AWS already ships and maintains this transformation definition in its registry.</w:t>
-      </w:r>
-    </w:p>
-    <w:p>
-      <w:pPr>
-        <w:pStyle w:val="Heading1"/>
-      </w:pPr>
-      <w:r>
-        <w:t>4. Step-by-Step Process</w:t>
+        <w:rPr>
+          <w:b w:val="0"/>
+          <w:i w:val="0"/>
+        </w:rPr>
+        <w:t>Result: modernized typing generics and an unprompted bonus fix (.format() → f-string). Nothing here was actually broken — a pure style upgrade, correctly executed.</w:t>
       </w:r>
     </w:p>
     <w:p>
@@ -860,43 +1268,7 @@
         <w:pStyle w:val="Heading2"/>
       </w:pPr>
       <w:r>
-        <w:t>Step 1: Install and verify the AWS Transform CLI (atx)</w:t>
-      </w:r>
-    </w:p>
-    <w:p>
-      <w:r>
-        <w:t>Installed atx via AWS’s official install script. Verified the binary with atx --version (returned 3.11.0), then ran atx custom def exec --help to confirm the exact command-line flags before relying on any documentation examples — this caught two real gaps versus the written research doc (see Step 4 below).</w:t>
-      </w:r>
-    </w:p>
-    <w:p>
-      <w:pPr>
-        <w:pStyle w:val="Heading2"/>
-      </w:pPr>
-      <w:r>
-        <w:t>Step 2: Build the toy Lambda application (the "before" state)</w:t>
-      </w:r>
-    </w:p>
-    <w:p>
-      <w:r>
-        <w:t>Wrote a minimal Node.js Lambda handler (index.js) deliberately in the old callback style, plus a package.json declaring "engines.node": "18.x", plus a small local test script (test/local-invoke.js) that invokes the handler directly with a sample event and asserts on the response. This test script was written to support both the old callback-style handler and a future async-style handler without needing to be edited later — because it would later double as AWS Transform’s own validation gate.</w:t>
-      </w:r>
-    </w:p>
-    <w:p>
-      <w:pPr>
-        <w:pStyle w:val="Heading2"/>
-      </w:pPr>
-      <w:r>
-        <w:t>Step 3: Deploy the "before" version to real AWS</w:t>
-      </w:r>
-    </w:p>
-    <w:p>
-      <w:r>
-        <w:t>Created a dedicated IAM execution role (least-privilege — only the AWS-managed AWSLambdaBasicExecutionRole policy, which permits the function to run and write CloudWatch logs and nothing else) and deployed the function to AWS Lambda on nodejs18.x. AWS Lambda periodically blocks creating brand-new functions on fully deprecated runtimes (while still letting existing ones keep running); nodejs18.x was confirmed still creatable on this account on the first attempt.</w:t>
-      </w:r>
-    </w:p>
-    <w:p>
-      <w:r>
-        <w:t>Invoked the live function once with a fixed test payload and saved the response as the "before" baseline:</w:t>
+        <w:t>3.2 Java — AWS/java-version-upgrade (8 → 17)</w:t>
       </w:r>
     </w:p>
     <w:p>
@@ -911,7 +1283,7 @@
           <w:color w:val="1A1A1A"/>
           <w:sz w:val="18"/>
         </w:rPr>
-        <w:t>Request payload:  {"name":"AWS Transform"}</w:t>
+        <w:t>&lt;!-- pom.xml, only line changed --&gt;</w:t>
       </w:r>
       <w:r>
         <w:br/>
@@ -922,7 +1294,16 @@
           <w:color w:val="1A1A1A"/>
           <w:sz w:val="18"/>
         </w:rPr>
-        <w:t>Response:         {"message":"Hello, AWS Transform!"}</w:t>
+        <w:t>&lt;maven.compiler.release&gt;8&lt;/maven.compiler.release&gt;   →   17</w:t>
+      </w:r>
+    </w:p>
+    <w:p>
+      <w:r>
+        <w:rPr>
+          <w:b w:val="0"/>
+          <w:i w:val="0"/>
+        </w:rPr>
+        <w:t>Result: the transformation limited itself strictly to the compiler-release bump. It did not rewrite the hand-rolled POJO into a Java 16+ record, a plausible modernization that was anticipated but did not happen — a legitimate, more conservative outcome worth reporting honestly. There was nothing in this toy app that would actually fail to compile on 17, so the transformation correctly did the minimum necessary.</w:t>
       </w:r>
     </w:p>
     <w:p>
@@ -930,12 +1311,16 @@
         <w:pStyle w:val="Heading2"/>
       </w:pPr>
       <w:r>
-        <w:t>Step 4: Run AWS Transform (the actual upgrade)</w:t>
+        <w:t>3.3 Node.js — AWS/nodejs-version-upgrade (12 → 22, general-purpose)</w:t>
       </w:r>
     </w:p>
     <w:p>
       <w:r>
-        <w:t>This is the core step. AWS Transform’s custom track requires its target to be a real git repository (it works by creating its proposed changes on a separate git branch, rather than editing files in place — nothing auto-merges). The toy Lambda’s source was set up as its own git repository to satisfy this, and the transformation was run with:</w:t>
+        <w:rPr>
+          <w:b w:val="0"/>
+          <w:i w:val="0"/>
+        </w:rPr>
+        <w:t>Distinct from the Lambda-specific transformation used in Stage 1 — this one targets any Node.js app, not Lambda functions specifically.</w:t>
       </w:r>
     </w:p>
     <w:p>
@@ -950,7 +1335,7 @@
           <w:color w:val="1A1A1A"/>
           <w:sz w:val="18"/>
         </w:rPr>
-        <w:t>atx custom def exec \</w:t>
+        <w:t>// Before</w:t>
       </w:r>
       <w:r>
         <w:br/>
@@ -961,7 +1346,7 @@
           <w:color w:val="1A1A1A"/>
           <w:sz w:val="18"/>
         </w:rPr>
-        <w:t xml:space="preserve">  --code-repository-path . \</w:t>
+        <w:t>var buf = new Buffer(displayName, 'utf8');   // DeprecationWarning at runtime</w:t>
       </w:r>
       <w:r>
         <w:br/>
@@ -972,7 +1357,7 @@
           <w:color w:val="1A1A1A"/>
           <w:sz w:val="18"/>
         </w:rPr>
-        <w:t xml:space="preserve">  --transformation-name AWS/lambda-nodejs-runtime-upgrade \</w:t>
+        <w:t xml:space="preserve"> </w:t>
       </w:r>
       <w:r>
         <w:br/>
@@ -983,7 +1368,7 @@
           <w:color w:val="1A1A1A"/>
           <w:sz w:val="18"/>
         </w:rPr>
-        <w:t xml:space="preserve">  --build-command "node test/local-invoke.js" \</w:t>
+        <w:t>// After (produced by AWS Transform)</w:t>
       </w:r>
       <w:r>
         <w:br/>
@@ -994,7 +1379,65 @@
           <w:color w:val="1A1A1A"/>
           <w:sz w:val="18"/>
         </w:rPr>
-        <w:t xml:space="preserve">  --configuration additionalPlanContext="Target Node.js 24" \</w:t>
+        <w:t>var buf = Buffer.from(displayName, 'utf8');  // no warning</w:t>
+      </w:r>
+    </w:p>
+    <w:p>
+      <w:r>
+        <w:rPr>
+          <w:b w:val="0"/>
+          <w:i w:val="0"/>
+        </w:rPr>
+        <w:t>Result: fixed exactly the deprecated API Phase 1’s own research cited as a real concern. Left var untouched rather than modernizing to let/const — again, correctly conservative: this general transformation isn’t obligated to force a style rewrite, only version compatibility.</w:t>
+      </w:r>
+    </w:p>
+    <w:p>
+      <w:pPr>
+        <w:pStyle w:val="Heading1"/>
+      </w:pPr>
+      <w:r>
+        <w:t>4. Stage 3 — Deliberately Harder Cases</w:t>
+      </w:r>
+    </w:p>
+    <w:p>
+      <w:r>
+        <w:rPr>
+          <w:b w:val="0"/>
+          <w:i w:val="0"/>
+        </w:rPr>
+        <w:t>Stage 2 showed the transformation is conservative — it fixes what genuinely needs fixing and leaves the rest alone. That’s reasonable behavior, but it means a "trivial" toy app proves little about the tool’s actual reasoning ability. Stage 3 built two new toy apps specifically containing a real, verified breaking or deprecated API, with the exact same generic upgrade prompt as before — no hints given about the specific problem in either case.</w:t>
+      </w:r>
+    </w:p>
+    <w:p>
+      <w:pPr>
+        <w:pStyle w:val="Heading2"/>
+      </w:pPr>
+      <w:r>
+        <w:t>4.1 Java — java.rmi.activation, removed in JDK 17 (JEP 407)</w:t>
+      </w:r>
+    </w:p>
+    <w:p>
+      <w:r>
+        <w:rPr>
+          <w:b/>
+          <w:i w:val="0"/>
+        </w:rPr>
+        <w:t>Verified empirically, before building anything, against the real local JDK 17:</w:t>
+      </w:r>
+    </w:p>
+    <w:p>
+      <w:pPr>
+        <w:spacing w:before="80" w:after="160"/>
+        <w:ind w:left="360"/>
+        <w:shd w:val="clear" w:color="auto" w:fill="F2F2F2"/>
+      </w:pPr>
+      <w:r>
+        <w:rPr>
+          <w:rFonts w:ascii="Consolas" w:hAnsi="Consolas"/>
+          <w:color w:val="1A1A1A"/>
+          <w:sz w:val="18"/>
+        </w:rPr>
+        <w:t>$ javac --release 11 RmiCheck.java     # importing java.rmi.activation.ActivationException</w:t>
       </w:r>
       <w:r>
         <w:br/>
@@ -1005,7 +1448,7 @@
           <w:color w:val="1A1A1A"/>
           <w:sz w:val="18"/>
         </w:rPr>
-        <w:t xml:space="preserve">  --non-interactive \</w:t>
+        <w:t>exit: 0                                 # compiles fine, targeting release 11</w:t>
       </w:r>
       <w:r>
         <w:br/>
@@ -1016,73 +1459,126 @@
           <w:color w:val="1A1A1A"/>
           <w:sz w:val="18"/>
         </w:rPr>
-        <w:t xml:space="preserve">  --trust-all-tools</w:t>
+        <w:t xml:space="preserve"> </w:t>
+      </w:r>
+      <w:r>
+        <w:br/>
+      </w:r>
+      <w:r>
+        <w:rPr>
+          <w:rFonts w:ascii="Consolas" w:hAnsi="Consolas"/>
+          <w:color w:val="1A1A1A"/>
+          <w:sz w:val="18"/>
+        </w:rPr>
+        <w:t>$ javac RmiCheck.java                   # no --release, targets JDK 17 directly</w:t>
+      </w:r>
+      <w:r>
+        <w:br/>
+      </w:r>
+      <w:r>
+        <w:rPr>
+          <w:rFonts w:ascii="Consolas" w:hAnsi="Consolas"/>
+          <w:color w:val="1A1A1A"/>
+          <w:sz w:val="18"/>
+        </w:rPr>
+        <w:t>error: package java.rmi.activation does not exist</w:t>
       </w:r>
     </w:p>
     <w:p>
       <w:r>
-        <w:t>How AWS Transform was actually used here, concretely:</w:t>
+        <w:rPr>
+          <w:b w:val="0"/>
+          <w:i w:val="0"/>
+        </w:rPr>
+        <w:t>RMI Activation has no drop-in replacement — it was removed as obsolete. The toy app declared greet()/main() as "throws ActivationException", a realistic pattern for legacy code carrying an unused checked-exception declaration. A clean Maven build (mvn clean compile exec:java, ruling out stale-bytecode false positives) confirmed: compiles and runs fine at release=11, genuinely fails to compile at release=17.</w:t>
       </w:r>
     </w:p>
     <w:p>
       <w:pPr>
-        <w:pStyle w:val="ListBullet"/>
+        <w:spacing w:before="80" w:after="160"/>
+        <w:ind w:left="360"/>
+        <w:shd w:val="clear" w:color="auto" w:fill="F2F2F2"/>
       </w:pPr>
       <w:r>
         <w:rPr>
-          <w:i/>
+          <w:rFonts w:ascii="Consolas" w:hAnsi="Consolas"/>
+          <w:color w:val="1A1A1A"/>
+          <w:sz w:val="18"/>
         </w:rPr>
-        <w:t xml:space="preserve">--transformation-name AWS/lambda-nodejs-runtime-upgrade </w:t>
+        <w:t>// Before</w:t>
       </w:r>
       <w:r>
-        <w:t>selects AWS’s pre-built, managed transformation definition for Lambda Node.js runtime upgrades from AWS’s registry — no custom transformation logic was written.</w:t>
+        <w:br/>
       </w:r>
-    </w:p>
-    <w:p>
-      <w:pPr>
-        <w:pStyle w:val="ListBullet"/>
-      </w:pPr>
       <w:r>
         <w:rPr>
-          <w:i/>
+          <w:rFonts w:ascii="Consolas" w:hAnsi="Consolas"/>
+          <w:color w:val="1A1A1A"/>
+          <w:sz w:val="18"/>
         </w:rPr>
-        <w:t xml:space="preserve">--configuration additionalPlanContext="Target Node.js 24" </w:t>
+        <w:t>import java.rmi.activation.ActivationException;</w:t>
       </w:r>
       <w:r>
-        <w:t>told the agent which target runtime version to upgrade to.</w:t>
+        <w:br/>
       </w:r>
-    </w:p>
-    <w:p>
-      <w:pPr>
-        <w:pStyle w:val="ListBullet"/>
-      </w:pPr>
       <w:r>
         <w:rPr>
-          <w:i/>
+          <w:rFonts w:ascii="Consolas" w:hAnsi="Consolas"/>
+          <w:color w:val="1A1A1A"/>
+          <w:sz w:val="18"/>
         </w:rPr>
-        <w:t xml:space="preserve">--build-command "node test/local-invoke.js" </w:t>
+        <w:t>public static Greeting greet(String name) throws ActivationException { ... }</w:t>
       </w:r>
       <w:r>
-        <w:t>supplied the quality gate: AWS Transform will not consider the transformation done until this command exits successfully against the code it rewrote.</w:t>
+        <w:br/>
       </w:r>
-    </w:p>
-    <w:p>
-      <w:pPr>
-        <w:pStyle w:val="ListBullet"/>
-      </w:pPr>
       <w:r>
         <w:rPr>
-          <w:b/>
+          <w:rFonts w:ascii="Consolas" w:hAnsi="Consolas"/>
+          <w:color w:val="1A1A1A"/>
+          <w:sz w:val="18"/>
         </w:rPr>
-        <w:t xml:space="preserve">Two real gaps were discovered here versus the Phase 1 research doc: </w:t>
+        <w:t xml:space="preserve"> </w:t>
       </w:r>
       <w:r>
-        <w:t>atx does not auto-detect a build/test command from package.json — an explicit --build-command is required, or there is no validation gate at all. And running the CLI unattended (not from an interactive terminal) requires --non-interactive and --trust-all-tools, or the process hangs waiting on prompts.</w:t>
+        <w:br/>
+      </w:r>
+      <w:r>
+        <w:rPr>
+          <w:rFonts w:ascii="Consolas" w:hAnsi="Consolas"/>
+          <w:color w:val="1A1A1A"/>
+          <w:sz w:val="18"/>
+        </w:rPr>
+        <w:t>// After (produced by AWS Transform — no hints given)</w:t>
+      </w:r>
+      <w:r>
+        <w:br/>
+      </w:r>
+      <w:r>
+        <w:rPr>
+          <w:rFonts w:ascii="Consolas" w:hAnsi="Consolas"/>
+          <w:color w:val="1A1A1A"/>
+          <w:sz w:val="18"/>
+        </w:rPr>
+        <w:t>public static Greeting greet(String name) throws Exception { ... }</w:t>
       </w:r>
     </w:p>
     <w:p>
       <w:r>
-        <w:t>AWS Transform completed the transformation, reporting "Build status: Success" and committing its changes to a new branch it created itself (atx-result-staging-20260827_092714_f797793f). Total cost of this run: 15.13 Agent Minutes (AWS Transform’s billing unit — useful for estimating cost before running this at scale across many repositories).</w:t>
+        <w:rPr>
+          <w:b w:val="0"/>
+          <w:i w:val="0"/>
+        </w:rPr>
+        <w:t>AWS Transform found the removed import on its own and made the correct judgment call: since ActivationException was never actually thrown in this code, widening the throws clause to the generic Exception is the minimal, correct fix — not a hack. Independently re-verified with a clean rebuild, both on its branch and again after merging/flattening.</w:t>
+      </w:r>
+    </w:p>
+    <w:p>
+      <w:r>
+        <w:rPr>
+          <w:b w:val="0"/>
+          <w:i/>
+        </w:rPr>
+        <w:t>Agent Minutes used: 17.09.</w:t>
       </w:r>
     </w:p>
     <w:p>
@@ -1090,299 +1586,150 @@
         <w:pStyle w:val="Heading2"/>
       </w:pPr>
       <w:r>
-        <w:t>Step 5: Independently review and verify the transformation</w:t>
+        <w:t>4.2 Python — datetime.datetime.utcnow(), deprecated since 3.12</w:t>
       </w:r>
     </w:p>
     <w:p>
       <w:r>
-        <w:t>Rather than trusting AWS Transform’s own "Build status: Success" report at face value, the diff was reviewed by hand (git diff master → the new branch), confirming exactly the expected callback → async/await rewrite and the engines.node bump described in Section 2. The local test was then independently re-run on that branch — separately from AWS Transform’s own run of it — and it passed, confirming the transformed code genuinely behaves correctly, not just that the tool claimed success.</w:t>
+        <w:rPr>
+          <w:b/>
+          <w:i w:val="0"/>
+        </w:rPr>
+        <w:t>Verified empirically before building anything, on the real local Python 3.14.5:</w:t>
       </w:r>
     </w:p>
     <w:p>
       <w:pPr>
-        <w:pStyle w:val="Heading2"/>
+        <w:spacing w:before="80" w:after="160"/>
+        <w:ind w:left="360"/>
+        <w:shd w:val="clear" w:color="auto" w:fill="F2F2F2"/>
       </w:pPr>
       <w:r>
-        <w:t>Step 6: Merge and redeploy the upgraded code (the "after" state)</w:t>
+        <w:rPr>
+          <w:rFonts w:ascii="Consolas" w:hAnsi="Consolas"/>
+          <w:color w:val="1A1A1A"/>
+          <w:sz w:val="18"/>
+        </w:rPr>
+        <w:t>$ python3 -W always::DeprecationWarning -c "import datetime; datetime.datetime.utcnow()"</w:t>
+      </w:r>
+      <w:r>
+        <w:br/>
+      </w:r>
+      <w:r>
+        <w:rPr>
+          <w:rFonts w:ascii="Consolas" w:hAnsi="Consolas"/>
+          <w:color w:val="1A1A1A"/>
+          <w:sz w:val="18"/>
+        </w:rPr>
+        <w:t>DeprecationWarning: datetime.datetime.utcnow() is deprecated and scheduled</w:t>
+      </w:r>
+      <w:r>
+        <w:br/>
+      </w:r>
+      <w:r>
+        <w:rPr>
+          <w:rFonts w:ascii="Consolas" w:hAnsi="Consolas"/>
+          <w:color w:val="1A1A1A"/>
+          <w:sz w:val="18"/>
+        </w:rPr>
+        <w:t>for removal in a future version. Use timezone-aware objects to represent</w:t>
+      </w:r>
+      <w:r>
+        <w:br/>
+      </w:r>
+      <w:r>
+        <w:rPr>
+          <w:rFonts w:ascii="Consolas" w:hAnsi="Consolas"/>
+          <w:color w:val="1A1A1A"/>
+          <w:sz w:val="18"/>
+        </w:rPr>
+        <w:t>datetimes in UTC: datetime.datetime.now(datetime.UTC).</w:t>
       </w:r>
     </w:p>
     <w:p>
       <w:r>
-        <w:t>Merged AWS Transform’s branch back into the main branch, then redeployed to the exact same AWS Lambda function (not a new one) using the same deploy script from Step 3, this time specifying nodejs24.x as the runtime. AWS Lambda accepted the update and the function returned to an Active state.</w:t>
+        <w:rPr>
+          <w:b w:val="0"/>
+          <w:i w:val="0"/>
+        </w:rPr>
+        <w:t>Unlike the Java case, this API is deprecated but not yet removed — the closer parallel is Stage 2’s Node.js new Buffer() case: still functional today, flagged, with one clear recommended replacement. The test was written to assert only on the functional shape of the output (an ISO-8601-prefixed string), never on the warning itself, so it stayed valid unedited both before and after.</w:t>
       </w:r>
     </w:p>
     <w:p>
       <w:pPr>
-        <w:pStyle w:val="Heading2"/>
+        <w:spacing w:before="80" w:after="160"/>
+        <w:ind w:left="360"/>
+        <w:shd w:val="clear" w:color="auto" w:fill="F2F2F2"/>
       </w:pPr>
       <w:r>
-        <w:t>Step 7: Verify the upgrade end-to-end</w:t>
+        <w:rPr>
+          <w:rFonts w:ascii="Consolas" w:hAnsi="Consolas"/>
+          <w:color w:val="1A1A1A"/>
+          <w:sz w:val="18"/>
+        </w:rPr>
+        <w:t># Before</w:t>
+      </w:r>
+      <w:r>
+        <w:br/>
+      </w:r>
+      <w:r>
+        <w:rPr>
+          <w:rFonts w:ascii="Consolas" w:hAnsi="Consolas"/>
+          <w:color w:val="1A1A1A"/>
+          <w:sz w:val="18"/>
+        </w:rPr>
+        <w:t>now = datetime.datetime.utcnow()</w:t>
+      </w:r>
+      <w:r>
+        <w:br/>
+      </w:r>
+      <w:r>
+        <w:rPr>
+          <w:rFonts w:ascii="Consolas" w:hAnsi="Consolas"/>
+          <w:color w:val="1A1A1A"/>
+          <w:sz w:val="18"/>
+        </w:rPr>
+        <w:t xml:space="preserve"> </w:t>
+      </w:r>
+      <w:r>
+        <w:br/>
+      </w:r>
+      <w:r>
+        <w:rPr>
+          <w:rFonts w:ascii="Consolas" w:hAnsi="Consolas"/>
+          <w:color w:val="1A1A1A"/>
+          <w:sz w:val="18"/>
+        </w:rPr>
+        <w:t># After (produced by AWS Transform — no hints given)</w:t>
+      </w:r>
+      <w:r>
+        <w:br/>
+      </w:r>
+      <w:r>
+        <w:rPr>
+          <w:rFonts w:ascii="Consolas" w:hAnsi="Consolas"/>
+          <w:color w:val="1A1A1A"/>
+          <w:sz w:val="18"/>
+        </w:rPr>
+        <w:t>now = datetime.datetime.now(datetime.timezone.utc)</w:t>
       </w:r>
     </w:p>
     <w:p>
       <w:r>
-        <w:t>Invoked the now-upgraded live function with the identical test payload used in Step 3, and compared the two responses directly:</w:t>
-      </w:r>
-    </w:p>
-    <w:tbl>
-      <w:tblPr>
-        <w:tblStyle w:val="LightGrid-Accent1"/>
-        <w:tblW w:type="auto" w:w="0"/>
-        <w:jc w:val="center"/>
-        <w:tblLook w:firstColumn="1" w:firstRow="1" w:lastColumn="0" w:lastRow="0" w:noHBand="0" w:noVBand="1" w:val="04A0"/>
-      </w:tblPr>
-      <w:tblGrid>
-        <w:gridCol w:w="2160"/>
-        <w:gridCol w:w="2160"/>
-        <w:gridCol w:w="2160"/>
-        <w:gridCol w:w="2160"/>
-      </w:tblGrid>
-      <w:tr>
-        <w:tc>
-          <w:tcPr>
-            <w:tcW w:type="dxa" w:w="2304"/>
-            <w:shd w:val="clear" w:color="auto" w:fill="2E5395"/>
-          </w:tcPr>
-          <w:p>
-            <w:r>
-              <w:rPr>
-                <w:b/>
-                <w:color w:val="FFFFFF"/>
-                <w:sz w:val="20"/>
-              </w:rPr>
-              <w:t>Check</w:t>
-            </w:r>
-          </w:p>
-        </w:tc>
-        <w:tc>
-          <w:tcPr>
-            <w:tcW w:type="dxa" w:w="3168"/>
-            <w:shd w:val="clear" w:color="auto" w:fill="2E5395"/>
-          </w:tcPr>
-          <w:p>
-            <w:r>
-              <w:rPr>
-                <w:b/>
-                <w:color w:val="FFFFFF"/>
-                <w:sz w:val="20"/>
-              </w:rPr>
-              <w:t>Before (Step 3)</w:t>
-            </w:r>
-          </w:p>
-        </w:tc>
-        <w:tc>
-          <w:tcPr>
-            <w:tcW w:type="dxa" w:w="3168"/>
-            <w:shd w:val="clear" w:color="auto" w:fill="2E5395"/>
-          </w:tcPr>
-          <w:p>
-            <w:r>
-              <w:rPr>
-                <w:b/>
-                <w:color w:val="FFFFFF"/>
-                <w:sz w:val="20"/>
-              </w:rPr>
-              <w:t>After (Step 7)</w:t>
-            </w:r>
-          </w:p>
-        </w:tc>
-        <w:tc>
-          <w:tcPr>
-            <w:tcW w:type="dxa" w:w="2016"/>
-            <w:shd w:val="clear" w:color="auto" w:fill="2E5395"/>
-          </w:tcPr>
-          <w:p>
-            <w:r>
-              <w:rPr>
-                <w:b/>
-                <w:color w:val="FFFFFF"/>
-                <w:sz w:val="20"/>
-              </w:rPr>
-              <w:t>Result</w:t>
-            </w:r>
-          </w:p>
-        </w:tc>
-      </w:tr>
-      <w:tr>
-        <w:tc>
-          <w:tcPr>
-            <w:tcW w:type="dxa" w:w="2304"/>
-          </w:tcPr>
-          <w:p>
-            <w:r>
-              <w:rPr>
-                <w:sz w:val="20"/>
-              </w:rPr>
-              <w:t>Lambda runtime</w:t>
-            </w:r>
-          </w:p>
-        </w:tc>
-        <w:tc>
-          <w:tcPr>
-            <w:tcW w:type="dxa" w:w="3168"/>
-          </w:tcPr>
-          <w:p>
-            <w:r>
-              <w:rPr>
-                <w:sz w:val="20"/>
-              </w:rPr>
-              <w:t>nodejs18.x</w:t>
-            </w:r>
-          </w:p>
-        </w:tc>
-        <w:tc>
-          <w:tcPr>
-            <w:tcW w:type="dxa" w:w="3168"/>
-          </w:tcPr>
-          <w:p>
-            <w:r>
-              <w:rPr>
-                <w:sz w:val="20"/>
-              </w:rPr>
-              <w:t>nodejs24.x</w:t>
-            </w:r>
-          </w:p>
-        </w:tc>
-        <w:tc>
-          <w:tcPr>
-            <w:tcW w:type="dxa" w:w="2016"/>
-          </w:tcPr>
-          <w:p>
-            <w:r>
-              <w:rPr>
-                <w:sz w:val="20"/>
-              </w:rPr>
-              <w:t>Changed as expected</w:t>
-            </w:r>
-          </w:p>
-        </w:tc>
-      </w:tr>
-      <w:tr>
-        <w:tc>
-          <w:tcPr>
-            <w:tcW w:type="dxa" w:w="2304"/>
-          </w:tcPr>
-          <w:p>
-            <w:r>
-              <w:rPr>
-                <w:sz w:val="20"/>
-              </w:rPr>
-              <w:t>Function state</w:t>
-            </w:r>
-          </w:p>
-        </w:tc>
-        <w:tc>
-          <w:tcPr>
-            <w:tcW w:type="dxa" w:w="3168"/>
-          </w:tcPr>
-          <w:p>
-            <w:r>
-              <w:rPr>
-                <w:sz w:val="20"/>
-              </w:rPr>
-              <w:t>Active</w:t>
-            </w:r>
-          </w:p>
-        </w:tc>
-        <w:tc>
-          <w:tcPr>
-            <w:tcW w:type="dxa" w:w="3168"/>
-          </w:tcPr>
-          <w:p>
-            <w:r>
-              <w:rPr>
-                <w:sz w:val="20"/>
-              </w:rPr>
-              <w:t>Active</w:t>
-            </w:r>
-          </w:p>
-        </w:tc>
-        <w:tc>
-          <w:tcPr>
-            <w:tcW w:type="dxa" w:w="2016"/>
-          </w:tcPr>
-          <w:p>
-            <w:r>
-              <w:rPr>
-                <w:sz w:val="20"/>
-              </w:rPr>
-              <w:t>No downtime/failure</w:t>
-            </w:r>
-          </w:p>
-        </w:tc>
-      </w:tr>
-      <w:tr>
-        <w:tc>
-          <w:tcPr>
-            <w:tcW w:type="dxa" w:w="2304"/>
-          </w:tcPr>
-          <w:p>
-            <w:r>
-              <w:rPr>
-                <w:sz w:val="20"/>
-              </w:rPr>
-              <w:t>Invoke response</w:t>
-            </w:r>
-          </w:p>
-        </w:tc>
-        <w:tc>
-          <w:tcPr>
-            <w:tcW w:type="dxa" w:w="3168"/>
-          </w:tcPr>
-          <w:p>
-            <w:r>
-              <w:rPr>
-                <w:sz w:val="20"/>
-              </w:rPr>
-              <w:t>{"message":"Hello, AWS Transform!"}</w:t>
-            </w:r>
-          </w:p>
-        </w:tc>
-        <w:tc>
-          <w:tcPr>
-            <w:tcW w:type="dxa" w:w="3168"/>
-          </w:tcPr>
-          <w:p>
-            <w:r>
-              <w:rPr>
-                <w:sz w:val="20"/>
-              </w:rPr>
-              <w:t>{"message":"Hello, AWS Transform!"}</w:t>
-            </w:r>
-          </w:p>
-        </w:tc>
-        <w:tc>
-          <w:tcPr>
-            <w:tcW w:type="dxa" w:w="2016"/>
-          </w:tcPr>
-          <w:p>
-            <w:r>
-              <w:rPr>
-                <w:sz w:val="20"/>
-              </w:rPr>
-              <w:t>Byte-identical</w:t>
-            </w:r>
-          </w:p>
-        </w:tc>
-      </w:tr>
-    </w:tbl>
-    <w:p/>
-    <w:p>
-      <w:r>
-        <w:t>The before/after invoke responses were diffed with the standard diff command and produced zero output — proving the function behaves identically to a real caller, despite running on a different Node.js runtime major version and a rewritten code style underneath.</w:t>
-      </w:r>
-    </w:p>
-    <w:p>
-      <w:pPr>
-        <w:pStyle w:val="Heading2"/>
-      </w:pPr>
-      <w:r>
-        <w:t>Step 8: Clean up</w:t>
+        <w:rPr>
+          <w:b w:val="0"/>
+          <w:i w:val="0"/>
+        </w:rPr>
+        <w:t>AWS Transform replaced it with a fully valid timezone-aware equivalent. One honest nuance: it used datetime.timezone.utc rather than the newer datetime.UTC alias the deprecation message itself suggests — both are correct and equivalent, just a different spelling of the same fix. Confirmed independently: the DeprecationWarning is genuinely gone after the upgrade, re-verified again after flattening.</w:t>
       </w:r>
     </w:p>
     <w:p>
       <w:r>
-        <w:t>Since this created real, billable AWS resources, both the Lambda function and its IAM role were deleted once the results were captured and written up (aws lambda delete-function and aws iam delete-role), returning the AWS account to its state prior to this exercise.</w:t>
+        <w:rPr>
+          <w:b w:val="0"/>
+          <w:i/>
+        </w:rPr>
+        <w:t>Agent Minutes used: 15.60.</w:t>
       </w:r>
     </w:p>
     <w:p>
@@ -1395,12 +1742,29 @@
     </w:p>
     <w:p>
       <w:r>
-        <w:t>AWS Transform’s managed AWS/lambda-nodejs-runtime-upgrade transformation genuinely performs an in-place Node.js Lambda runtime upgrade — rewriting callback-style handler code to async/await, updating the package manifest, and validating the result against a user-supplied test command — while preserving the function’s observable behavior. This was confirmed against a real, deployed AWS Lambda function in a real AWS account, with the before/after invoke responses proven identical, not merely inferred from documentation.</w:t>
+        <w:rPr>
+          <w:b w:val="0"/>
+          <w:i w:val="0"/>
+        </w:rPr>
+        <w:t>Across six POCs — one real AWS deployment and five local, spanning three languages and two AWS Lambda-specific vs. general-purpose transformation families — AWS Transform’s managed transformations consistently did the right thing: real fixes where something was genuinely broken or deprecated, and correctly minimal changes where nothing was. The clearest evidence came from the two deliberately harder cases (Stage 3): given no hints, the tool found and correctly fixed a JDK API removed entirely in the target version and a Python stdlib API genuinely deprecated with a real runtime warning — the kind of result that a version-number bump alone could not produce.</w:t>
       </w:r>
     </w:p>
     <w:p>
       <w:r>
-        <w:t>Two practical findings worth carrying into any larger use of this capability: (1) an explicit --build-command is required for AWS Transform to have any validation gate at all, and (2) unattended/scripted use requires --non-interactive and --trust-all-tools. Neither is documented in AWS’s own public blog-post examples reviewed during Phase 1 — both were only discovered by actually running the tool.</w:t>
+        <w:rPr>
+          <w:b w:val="0"/>
+          <w:i w:val="0"/>
+        </w:rPr>
+        <w:t>A consistent pattern worth carrying forward: every transformation run was more conservative than a first guess might predict, changing only what a build/test command proved was necessary. That is a feature, not a limitation — it means a supplied test command is doing real work as the tool’s actual quality gate, not a rubber stamp.</w:t>
+      </w:r>
+    </w:p>
+    <w:p>
+      <w:r>
+        <w:rPr>
+          <w:b w:val="0"/>
+          <w:i w:val="0"/>
+        </w:rPr>
+        <w:t>Two practical findings not documented in AWS’s own public examples reviewed during Phase 1, discovered only by running the tool: an explicit --build-command is required for AWS Transform to have any validation gate at all, and unattended/scripted use requires --non-interactive and --trust-all-tools.</w:t>
       </w:r>
     </w:p>
     <w:p/>
@@ -1409,7 +1773,7 @@
         <w:rPr>
           <w:i/>
         </w:rPr>
-        <w:t xml:space="preserve">Source code, deployment scripts, and full results (JSON invoke responses) for this exercise are available in a private GitHub repository: </w:t>
+        <w:t xml:space="preserve">Source code, deployment scripts, and full results (JSON invoke responses, all diffs, all six write-ups) are available in a private GitHub repository: </w:t>
       </w:r>
       <w:r>
         <w:rPr>

</xml_diff>